<commit_message>
One GPU per job automatically; 300-epoch baselines with 3 seeds
</commit_message>
<xml_diff>
--- a/DP-CTGAN_Experiment_Guide.docx
+++ b/DP-CTGAN_Experiment_Guide.docx
@@ -4975,7 +4975,137 @@
         <w:rPr>
           <w:b w:val="0"/>
         </w:rPr>
-        <w:t>Stage the work: run seed 0 first to see how long each method takes, then the remaining seeds.</w:t>
+        <w:t xml:space="preserve">synthcity's default training length (2,000 epochs) takes many hours per run: CTGAN needed 36 min on Adult, 59 min on Taiwan and about 7.5 h on Credit Card Fraud for one seed. </w:t>
+      </w:r>
+      <w:r>
+        <w:rPr>
+          <w:rFonts w:ascii="Consolas" w:hAnsi="Consolas"/>
+          <w:color w:val="1F3864"/>
+          <w:sz w:val="19"/>
+        </w:rPr>
+        <w:t>run_baselines.py</w:t>
+      </w:r>
+      <w:r>
+        <w:rPr>
+          <w:b w:val="0"/>
+        </w:rPr>
+        <w:t xml:space="preserve"> therefore trains CTGAN, TVAE and DP-GAN for </w:t>
+      </w:r>
+      <w:r>
+        <w:rPr>
+          <w:b/>
+        </w:rPr>
+        <w:t>300 epochs</w:t>
+      </w:r>
+      <w:r>
+        <w:rPr>
+          <w:b w:val="0"/>
+        </w:rPr>
+        <w:t xml:space="preserve"> (</w:t>
+      </w:r>
+      <w:r>
+        <w:rPr>
+          <w:rFonts w:ascii="Consolas" w:hAnsi="Consolas"/>
+          <w:color w:val="1F3864"/>
+          <w:sz w:val="19"/>
+        </w:rPr>
+        <w:t>--n-iter 300</w:t>
+      </w:r>
+      <w:r>
+        <w:rPr>
+          <w:b w:val="0"/>
+        </w:rPr>
+        <w:t xml:space="preserve">, the default of the original CTGAN paper; stored as </w:t>
+      </w:r>
+      <w:r>
+        <w:rPr>
+          <w:rFonts w:ascii="Consolas" w:hAnsi="Consolas"/>
+          <w:color w:val="1F3864"/>
+          <w:sz w:val="19"/>
+        </w:rPr>
+        <w:t>meta.n_iter</w:t>
+      </w:r>
+      <w:r>
+        <w:rPr>
+          <w:b w:val="0"/>
+        </w:rPr>
+        <w:t xml:space="preserve"> in each metrics.json). Baselines use </w:t>
+      </w:r>
+      <w:r>
+        <w:rPr>
+          <w:b/>
+        </w:rPr>
+        <w:t>3 seeds</w:t>
+      </w:r>
+      <w:r>
+        <w:rPr>
+          <w:b w:val="0"/>
+        </w:rPr>
+        <w:t xml:space="preserve"> (0, 1, 2). State both in the baseline table caption.</w:t>
+      </w:r>
+    </w:p>
+    <w:p>
+      <w:r>
+        <w:rPr>
+          <w:b w:val="0"/>
+        </w:rPr>
+        <w:t xml:space="preserve">synthcity is installed in the main </w:t>
+      </w:r>
+      <w:r>
+        <w:rPr>
+          <w:rFonts w:ascii="Consolas" w:hAnsi="Consolas"/>
+          <w:color w:val="1F3864"/>
+          <w:sz w:val="19"/>
+        </w:rPr>
+        <w:t>(dp-ctgan)</w:t>
+      </w:r>
+      <w:r>
+        <w:rPr>
+          <w:b w:val="0"/>
+        </w:rPr>
+        <w:t xml:space="preserve"> environment, so the baselines run with </w:t>
+      </w:r>
+      <w:r>
+        <w:rPr>
+          <w:rFonts w:ascii="Consolas" w:hAnsi="Consolas"/>
+          <w:color w:val="1F3864"/>
+          <w:sz w:val="19"/>
+        </w:rPr>
+        <w:t>python3</w:t>
+      </w:r>
+      <w:r>
+        <w:rPr>
+          <w:b w:val="0"/>
+        </w:rPr>
+        <w:t xml:space="preserve">. The </w:t>
+      </w:r>
+      <w:r>
+        <w:rPr>
+          <w:rFonts w:ascii="Consolas" w:hAnsi="Consolas"/>
+          <w:color w:val="1F3864"/>
+          <w:sz w:val="19"/>
+        </w:rPr>
+        <w:t>CRITICAL ... plugin_great</w:t>
+      </w:r>
+      <w:r>
+        <w:rPr>
+          <w:b w:val="0"/>
+        </w:rPr>
+        <w:t xml:space="preserve"> / </w:t>
+      </w:r>
+      <w:r>
+        <w:rPr>
+          <w:rFonts w:ascii="Consolas" w:hAnsi="Consolas"/>
+          <w:color w:val="1F3864"/>
+          <w:sz w:val="19"/>
+        </w:rPr>
+        <w:t>plugin_goggle</w:t>
+      </w:r>
+      <w:r>
+        <w:rPr>
+          <w:b w:val="0"/>
+        </w:rPr>
+        <w:t xml:space="preserve"> messages at start-up are harmless (plugins that are not used).</w:t>
       </w:r>
     </w:p>
     <w:p>
@@ -5005,10 +5135,17 @@
       <w:r>
         <w:rPr>
           <w:rFonts w:ascii="Consolas" w:hAnsi="Consolas"/>
+          <w:sz w:val="17"/>
+        </w:rPr>
+        <w:t>pkill -f run_baselines.py</w:t>
+      </w:r>
+      <w:r>
+        <w:rPr>
+          <w:rFonts w:ascii="Consolas" w:hAnsi="Consolas"/>
           <w:color w:val="5F7A5A"/>
           <w:sz w:val="17"/>
         </w:rPr>
-        <w:t># stage 1: seed 0 only</w:t>
+        <w:t xml:space="preserve">                                   # stop any baseline jobs started with the old settings</w:t>
       </w:r>
     </w:p>
     <w:p>
@@ -5026,7 +5163,15 @@
           <w:rFonts w:ascii="Consolas" w:hAnsi="Consolas"/>
           <w:sz w:val="17"/>
         </w:rPr>
-        <w:t>nohup env OMP_NUM_THREADS=8 LOKY_MAX_CPU_COUNT=8 .venv-synthcity/bin/python experiments/run_baselines.py --methods pategan dpgan aim --eps 1 3 10 --seeds 0 &gt; logs/bl_synthcity_dp.log 2&gt;&amp;1 &amp;</w:t>
+        <w:t>git pull</w:t>
+      </w:r>
+      <w:r>
+        <w:rPr>
+          <w:rFonts w:ascii="Consolas" w:hAnsi="Consolas"/>
+          <w:color w:val="5F7A5A"/>
+          <w:sz w:val="17"/>
+        </w:rPr>
+        <w:t xml:space="preserve">                                                    # get run_baselines.py with --n-iter</w:t>
       </w:r>
     </w:p>
     <w:p>
@@ -5044,7 +5189,15 @@
           <w:rFonts w:ascii="Consolas" w:hAnsi="Consolas"/>
           <w:sz w:val="17"/>
         </w:rPr>
-        <w:t>nohup env OMP_NUM_THREADS=8 LOKY_MAX_CPU_COUNT=8 .venv-synthcity/bin/python experiments/run_baselines.py --methods ctgan tvae --eps none --seeds 0 &gt; logs/bl_synthcity_nodp.log 2&gt;&amp;1 &amp;</w:t>
+        <w:t>rm -rf results/baselines/ctgan results/baselines/tvae results/baselines/dpgan</w:t>
+      </w:r>
+      <w:r>
+        <w:rPr>
+          <w:rFonts w:ascii="Consolas" w:hAnsi="Consolas"/>
+          <w:color w:val="5F7A5A"/>
+          <w:sz w:val="17"/>
+        </w:rPr>
+        <w:t xml:space="preserve">   # made with the old 2,000-epoch length</w:t>
       </w:r>
     </w:p>
     <w:p>
@@ -5059,10 +5212,63 @@
       </w:pPr>
       <w:r>
         <w:rPr>
+          <w:sz w:val="17"/>
+        </w:rPr>
+        <w:t xml:space="preserve"> </w:t>
+      </w:r>
+    </w:p>
+    <w:p>
+      <w:pPr>
+        <w:keepNext/>
+        <w:pBdr>
+          <w:left w:val="single" w:sz="12" w:space="6" w:color="A6B4C8"/>
+        </w:pBdr>
+        <w:shd w:val="clear" w:color="auto" w:fill="F2F4F7"/>
+        <w:spacing w:before="0" w:after="0" w:line="240" w:lineRule="auto"/>
+        <w:ind w:left="142"/>
+      </w:pPr>
+      <w:r>
+        <w:rPr>
           <w:rFonts w:ascii="Consolas" w:hAnsi="Consolas"/>
           <w:sz w:val="17"/>
         </w:rPr>
-        <w:t>wait</w:t>
+        <w:t>nohup bash -c 'OMP_NUM_THREADS=4 LOKY_MAX_CPU_COUNT=4 python3 experiments/run_baselines.py --methods pategan aim --eps 1 3 10 --seeds 0 1 2' &gt; logs/bl_pategan_aim.log 2&gt;&amp;1 &amp;</w:t>
+      </w:r>
+    </w:p>
+    <w:p>
+      <w:pPr>
+        <w:keepNext/>
+        <w:pBdr>
+          <w:left w:val="single" w:sz="12" w:space="6" w:color="A6B4C8"/>
+        </w:pBdr>
+        <w:shd w:val="clear" w:color="auto" w:fill="F2F4F7"/>
+        <w:spacing w:before="0" w:after="0" w:line="240" w:lineRule="auto"/>
+        <w:ind w:left="142"/>
+      </w:pPr>
+      <w:r>
+        <w:rPr>
+          <w:rFonts w:ascii="Consolas" w:hAnsi="Consolas"/>
+          <w:sz w:val="17"/>
+        </w:rPr>
+        <w:t>nohup env OMP_NUM_THREADS=4 LOKY_MAX_CPU_COUNT=4 python3 experiments/run_baselines.py --methods dpgan --eps 1 3 10 --seeds 0 1 2 &gt; logs/bl_dpgan.log 2&gt;&amp;1 &amp;</w:t>
+      </w:r>
+    </w:p>
+    <w:p>
+      <w:pPr>
+        <w:keepNext/>
+        <w:pBdr>
+          <w:left w:val="single" w:sz="12" w:space="6" w:color="A6B4C8"/>
+        </w:pBdr>
+        <w:shd w:val="clear" w:color="auto" w:fill="F2F4F7"/>
+        <w:spacing w:before="0" w:after="0" w:line="240" w:lineRule="auto"/>
+        <w:ind w:left="142"/>
+      </w:pPr>
+      <w:r>
+        <w:rPr>
+          <w:rFonts w:ascii="Consolas" w:hAnsi="Consolas"/>
+          <w:sz w:val="17"/>
+        </w:rPr>
+        <w:t>nohup env OMP_NUM_THREADS=4 LOKY_MAX_CPU_COUNT=4 python3 experiments/run_baselines.py --methods ctgan --eps none --seeds 0 1 2 &gt; logs/bl_ctgan.log 2&gt;&amp;1 &amp;</w:t>
       </w:r>
     </w:p>
     <w:p>
@@ -5080,7 +5286,85 @@
           <w:rFonts w:ascii="Consolas" w:hAnsi="Consolas"/>
           <w:sz w:val="17"/>
         </w:rPr>
-        <w:t>python3 -c "import json,glob; [print(f, round(json.load(open(f))['meta']['fit_seconds']/60,1),'min') for f in sorted(glob.glob('results/baselines/*/*/eps*/seed0/metrics.json'))]"</w:t>
+        <w:t>nohup env OMP_NUM_THREADS=4 LOKY_MAX_CPU_COUNT=4 python3 experiments/run_baselines.py --methods tvae --eps none --seeds 0 1 2 &gt; logs/bl_tvae.log 2&gt;&amp;1 &amp;</w:t>
+      </w:r>
+    </w:p>
+    <w:p>
+      <w:r>
+        <w:rPr>
+          <w:b/>
+        </w:rPr>
+        <w:t>Multiple GPUs:</w:t>
+      </w:r>
+      <w:r>
+        <w:rPr>
+          <w:b w:val="0"/>
+        </w:rPr>
+        <w:t xml:space="preserve"> every experiment script picks a GPU by itself when it starts (</w:t>
+      </w:r>
+      <w:r>
+        <w:rPr>
+          <w:rFonts w:ascii="Consolas" w:hAnsi="Consolas"/>
+          <w:color w:val="1F3864"/>
+          <w:sz w:val="19"/>
+        </w:rPr>
+        <w:t>experiments/gpu_select.py</w:t>
+      </w:r>
+      <w:r>
+        <w:rPr>
+          <w:b w:val="0"/>
+        </w:rPr>
+        <w:t xml:space="preserve">): the GPU with the fewest experiment processes, ties broken by free memory. The four jobs above therefore land on four different GPUs; each log starts with </w:t>
+      </w:r>
+      <w:r>
+        <w:rPr>
+          <w:rFonts w:ascii="Consolas" w:hAnsi="Consolas"/>
+          <w:color w:val="1F3864"/>
+          <w:sz w:val="19"/>
+        </w:rPr>
+        <w:t>[gpu] process ... -&gt; GPU k</w:t>
+      </w:r>
+      <w:r>
+        <w:rPr>
+          <w:b w:val="0"/>
+        </w:rPr>
+        <w:t xml:space="preserve">. To choose by hand, prefix a command with </w:t>
+      </w:r>
+      <w:r>
+        <w:rPr>
+          <w:rFonts w:ascii="Consolas" w:hAnsi="Consolas"/>
+          <w:color w:val="1F3864"/>
+          <w:sz w:val="19"/>
+        </w:rPr>
+        <w:t>CUDA_VISIBLE_DEVICES=2</w:t>
+      </w:r>
+      <w:r>
+        <w:rPr>
+          <w:b w:val="0"/>
+        </w:rPr>
+        <w:t xml:space="preserve">; </w:t>
+      </w:r>
+      <w:r>
+        <w:rPr>
+          <w:rFonts w:ascii="Consolas" w:hAnsi="Consolas"/>
+          <w:color w:val="1F3864"/>
+          <w:sz w:val="19"/>
+        </w:rPr>
+        <w:t>DPCTGAN_AUTO_GPU=0</w:t>
+      </w:r>
+      <w:r>
+        <w:rPr>
+          <w:b w:val="0"/>
+        </w:rPr>
+        <w:t xml:space="preserve"> switches it off.</w:t>
+      </w:r>
+    </w:p>
+    <w:p>
+      <w:r>
+        <w:rPr>
+          <w:b w:val="0"/>
+        </w:rPr>
+        <w:t>Finished PATE-GAN seed-0 runs are kept and skipped. Monitor, and get the fit time of every finished run:</w:t>
       </w:r>
     </w:p>
     <w:p>
@@ -5110,10 +5394,9 @@
       <w:r>
         <w:rPr>
           <w:rFonts w:ascii="Consolas" w:hAnsi="Consolas"/>
-          <w:color w:val="5F7A5A"/>
           <w:sz w:val="17"/>
         </w:rPr>
-        <w:t># stage 2: all seeds (finished seed-0 runs are skipped)</w:t>
+        <w:t>pgrep -fa run_baselines.py</w:t>
       </w:r>
     </w:p>
     <w:p>
@@ -5131,7 +5414,7 @@
           <w:rFonts w:ascii="Consolas" w:hAnsi="Consolas"/>
           <w:sz w:val="17"/>
         </w:rPr>
-        <w:t>nohup env OMP_NUM_THREADS=8 LOKY_MAX_CPU_COUNT=8 .venv-synthcity/bin/python experiments/run_baselines.py --methods pategan dpgan aim --eps 1 3 10 &gt; logs/bl_synthcity_dp.log 2&gt;&amp;1 &amp;</w:t>
+        <w:t>python3 experiments/check_outputs.py | sed -n '/5. Baselines/,/6. Aggregated/p'</w:t>
       </w:r>
     </w:p>
     <w:p>
@@ -5149,7 +5432,25 @@
           <w:rFonts w:ascii="Consolas" w:hAnsi="Consolas"/>
           <w:sz w:val="17"/>
         </w:rPr>
-        <w:t>nohup env OMP_NUM_THREADS=8 LOKY_MAX_CPU_COUNT=8 .venv-synthcity/bin/python experiments/run_baselines.py --methods ctgan tvae --eps none &gt; logs/bl_synthcity_nodp.log 2&gt;&amp;1 &amp;</w:t>
+        <w:t>python3 -c "import json,glob; [print(f.split('baselines/')[1], round(json.load(open(f))['meta']['fit_seconds']/60,1),'min') for f in sorted(glob.glob('results/baselines/*/*/eps*/seed*/metrics.json'))]"</w:t>
+      </w:r>
+    </w:p>
+    <w:p>
+      <w:pPr>
+        <w:keepNext/>
+        <w:pBdr>
+          <w:left w:val="single" w:sz="12" w:space="6" w:color="A6B4C8"/>
+        </w:pBdr>
+        <w:shd w:val="clear" w:color="auto" w:fill="F2F4F7"/>
+        <w:spacing w:before="0" w:after="0" w:line="240" w:lineRule="auto"/>
+        <w:ind w:left="142"/>
+      </w:pPr>
+      <w:r>
+        <w:rPr>
+          <w:rFonts w:ascii="Consolas" w:hAnsi="Consolas"/>
+          <w:sz w:val="17"/>
+        </w:rPr>
+        <w:t>tail -n 2 logs/bl_*.log</w:t>
       </w:r>
     </w:p>
     <w:p>
@@ -5167,7 +5468,15 @@
           <w:rFonts w:ascii="Consolas" w:hAnsi="Consolas"/>
           <w:sz w:val="17"/>
         </w:rPr>
-        <w:t>wait</w:t>
+        <w:t>nvidia-smi</w:t>
+      </w:r>
+      <w:r>
+        <w:rPr>
+          <w:rFonts w:ascii="Consolas" w:hAnsi="Consolas"/>
+          <w:color w:val="5F7A5A"/>
+          <w:sz w:val="17"/>
+        </w:rPr>
+        <w:t xml:space="preserve">                                                  # synthcity should be using the GPU</w:t>
       </w:r>
     </w:p>
     <w:p>
@@ -5175,7 +5484,7 @@
         <w:rPr>
           <w:b w:val="0"/>
         </w:rPr>
-        <w:t xml:space="preserve">If AIM or PATE-GAN is far too slow on Credit Card Fraud, restrict it, e.g. </w:t>
+        <w:t>If AIM takes more than about an hour per run on Credit Card Fraud, stop it (</w:t>
       </w:r>
       <w:r>
         <w:rPr>
@@ -5183,13 +5492,13 @@
           <w:color w:val="1F3864"/>
           <w:sz w:val="19"/>
         </w:rPr>
-        <w:t>--datasets adult taiwan_credit mimic3</w:t>
+        <w:t>pkill -f 'methods pategan aim'</w:t>
       </w:r>
       <w:r>
         <w:rPr>
           <w:b w:val="0"/>
         </w:rPr>
-        <w:t xml:space="preserve"> or </w:t>
+        <w:t xml:space="preserve">) and restart it without that dataset: </w:t>
       </w:r>
       <w:r>
         <w:rPr>
@@ -5197,27 +5506,13 @@
           <w:color w:val="1F3864"/>
           <w:sz w:val="19"/>
         </w:rPr>
-        <w:t>--seeds 0 1 2</w:t>
+        <w:t>--methods aim --datasets adult taiwan_credit mimic3 --eps 1 3 10 --seeds 0 1 2</w:t>
       </w:r>
       <w:r>
         <w:rPr>
           <w:b w:val="0"/>
         </w:rPr>
-        <w:t xml:space="preserve">, and state this in the paper. PrivBayes can be added with </w:t>
-      </w:r>
-      <w:r>
-        <w:rPr>
-          <w:rFonts w:ascii="Consolas" w:hAnsi="Consolas"/>
-          <w:color w:val="1F3864"/>
-          <w:sz w:val="19"/>
-        </w:rPr>
-        <w:t>--methods privbayes --eps 1 3 10</w:t>
-      </w:r>
-      <w:r>
-        <w:rPr>
-          <w:b w:val="0"/>
-        </w:rPr>
-        <w:t>.</w:t>
+        <w:t>. Say so in the paper.</w:t>
       </w:r>
     </w:p>
     <w:p>
@@ -5426,7 +5721,7 @@
                 <w:b w:val="0"/>
                 <w:sz w:val="18"/>
               </w:rPr>
-              <w:t>60 each (4 datasets × 3 ε × 5 seeds)</w:t>
+              <w:t>36 each (4 datasets × 3 ε × 3 seeds)</w:t>
             </w:r>
           </w:p>
         </w:tc>
@@ -5447,7 +5742,7 @@
                 <w:b w:val="0"/>
                 <w:sz w:val="18"/>
               </w:rPr>
-              <w:t>ctgan, tvae, smote</w:t>
+              <w:t>ctgan, tvae</w:t>
             </w:r>
           </w:p>
         </w:tc>
@@ -5466,7 +5761,45 @@
                 <w:b w:val="0"/>
                 <w:sz w:val="18"/>
               </w:rPr>
-              <w:t>20 each (4 datasets × No-DP × 5 seeds)</w:t>
+              <w:t>12 each (4 datasets × No-DP × 3 seeds)</w:t>
+            </w:r>
+          </w:p>
+        </w:tc>
+      </w:tr>
+      <w:tr>
+        <w:tc>
+          <w:tcPr>
+            <w:tcW w:type="dxa" w:w="3402"/>
+          </w:tcPr>
+          <w:p>
+            <w:pPr>
+              <w:spacing w:after="0" w:line="240" w:lineRule="auto"/>
+            </w:pPr>
+            <w:r/>
+            <w:r>
+              <w:rPr>
+                <w:b w:val="0"/>
+                <w:sz w:val="18"/>
+              </w:rPr>
+              <w:t>smote</w:t>
+            </w:r>
+          </w:p>
+        </w:tc>
+        <w:tc>
+          <w:tcPr>
+            <w:tcW w:type="dxa" w:w="6236"/>
+          </w:tcPr>
+          <w:p>
+            <w:pPr>
+              <w:spacing w:after="0" w:line="240" w:lineRule="auto"/>
+            </w:pPr>
+            <w:r/>
+            <w:r>
+              <w:rPr>
+                <w:b w:val="0"/>
+                <w:sz w:val="18"/>
+              </w:rPr>
+              <w:t>20 (4 datasets × 5 seeds; already done)</w:t>
             </w:r>
           </w:p>
         </w:tc>
@@ -9833,7 +10166,7 @@
           <w:color w:val="5F7A5A"/>
           <w:sz w:val="17"/>
         </w:rPr>
-        <w:t># ---- F. baselines</w:t>
+        <w:t># ---- F. baselines (3 seeds, 300 epochs for ctgan / tvae / dpgan)</w:t>
       </w:r>
     </w:p>
     <w:p>
@@ -9851,7 +10184,7 @@
           <w:rFonts w:ascii="Consolas" w:hAnsi="Consolas"/>
           <w:sz w:val="17"/>
         </w:rPr>
-        <w:t>nohup env OMP_NUM_THREADS=8 LOKY_MAX_CPU_COUNT=8 .venv-synthcity/bin/python experiments/run_baselines.py --methods pategan dpgan aim --eps 1 3 10 &gt; logs/bl_synthcity_dp.log 2&gt;&amp;1 &amp;</w:t>
+        <w:t>nohup bash -c 'OMP_NUM_THREADS=4 LOKY_MAX_CPU_COUNT=4 python3 experiments/run_baselines.py --methods pategan aim --eps 1 3 10 --seeds 0 1 2' &gt; logs/bl_pategan_aim.log 2&gt;&amp;1 &amp;</w:t>
       </w:r>
     </w:p>
     <w:p>
@@ -9869,7 +10202,7 @@
           <w:rFonts w:ascii="Consolas" w:hAnsi="Consolas"/>
           <w:sz w:val="17"/>
         </w:rPr>
-        <w:t>nohup env OMP_NUM_THREADS=8 LOKY_MAX_CPU_COUNT=8 .venv-synthcity/bin/python experiments/run_baselines.py --methods ctgan tvae --eps none &gt; logs/bl_synthcity_nodp.log 2&gt;&amp;1 &amp;</w:t>
+        <w:t>nohup env OMP_NUM_THREADS=4 LOKY_MAX_CPU_COUNT=4 python3 experiments/run_baselines.py --methods dpgan --eps 1 3 10 --seeds 0 1 2 &gt; logs/bl_dpgan.log 2&gt;&amp;1 &amp;</w:t>
       </w:r>
     </w:p>
     <w:p>
@@ -9887,7 +10220,51 @@
           <w:rFonts w:ascii="Consolas" w:hAnsi="Consolas"/>
           <w:sz w:val="17"/>
         </w:rPr>
-        <w:t>wait</w:t>
+        <w:t>nohup env OMP_NUM_THREADS=4 LOKY_MAX_CPU_COUNT=4 python3 experiments/run_baselines.py --methods ctgan --eps none --seeds 0 1 2 &gt; logs/bl_ctgan.log 2&gt;&amp;1 &amp;</w:t>
+      </w:r>
+    </w:p>
+    <w:p>
+      <w:pPr>
+        <w:keepNext w:val="0"/>
+        <w:pBdr>
+          <w:left w:val="single" w:sz="12" w:space="6" w:color="A6B4C8"/>
+        </w:pBdr>
+        <w:shd w:val="clear" w:color="auto" w:fill="F2F4F7"/>
+        <w:spacing w:before="0" w:after="0" w:line="240" w:lineRule="auto"/>
+        <w:ind w:left="142"/>
+      </w:pPr>
+      <w:r>
+        <w:rPr>
+          <w:rFonts w:ascii="Consolas" w:hAnsi="Consolas"/>
+          <w:sz w:val="17"/>
+        </w:rPr>
+        <w:t>nohup env OMP_NUM_THREADS=4 LOKY_MAX_CPU_COUNT=4 python3 experiments/run_baselines.py --methods tvae --eps none --seeds 0 1 2 &gt; logs/bl_tvae.log 2&gt;&amp;1 &amp;</w:t>
+      </w:r>
+    </w:p>
+    <w:p>
+      <w:pPr>
+        <w:keepNext w:val="0"/>
+        <w:pBdr>
+          <w:left w:val="single" w:sz="12" w:space="6" w:color="A6B4C8"/>
+        </w:pBdr>
+        <w:shd w:val="clear" w:color="auto" w:fill="F2F4F7"/>
+        <w:spacing w:before="0" w:after="0" w:line="240" w:lineRule="auto"/>
+        <w:ind w:left="142"/>
+      </w:pPr>
+      <w:r>
+        <w:rPr>
+          <w:rFonts w:ascii="Consolas" w:hAnsi="Consolas"/>
+          <w:sz w:val="17"/>
+        </w:rPr>
+        <w:t>python3 experiments/check_outputs.py</w:t>
+      </w:r>
+      <w:r>
+        <w:rPr>
+          <w:rFonts w:ascii="Consolas" w:hAnsi="Consolas"/>
+          <w:color w:val="5F7A5A"/>
+          <w:sz w:val="17"/>
+        </w:rPr>
+        <w:t xml:space="preserve">                                # repeat until section 5 is all [ok]</w:t>
       </w:r>
     </w:p>
     <w:p>

</xml_diff>